<commit_message>
docs: embed real dark terminal screenshots in 50-page technical audit report
</commit_message>
<xml_diff>
--- a/AUDITORIA_PRUEBAS_Y_DESPLIEGUE_RENDER_50_PAGINAS.docx
+++ b/AUDITORIA_PRUEBAS_Y_DESPLIEGUE_RENDER_50_PAGINAS.docx
@@ -3662,6 +3662,61 @@
     </w:p>
     <w:p>
       <w:pPr>
+        <w:spacing w:before="160" w:after="160"/>
+        <w:jc w:val="center"/>
+      </w:pPr>
+      <w:r>
+        <w:drawing>
+          <wp:inline xmlns:a="http://schemas.openxmlformats.org/drawingml/2006/main" xmlns:pic="http://schemas.openxmlformats.org/drawingml/2006/picture">
+            <wp:extent cx="5669280" cy="3366135"/>
+            <wp:docPr id="1" name="Picture 1"/>
+            <wp:cNvGraphicFramePr>
+              <a:graphicFrameLocks noChangeAspect="1"/>
+            </wp:cNvGraphicFramePr>
+            <a:graphic>
+              <a:graphicData uri="http://schemas.openxmlformats.org/drawingml/2006/picture">
+                <pic:pic>
+                  <pic:nvPicPr>
+                    <pic:cNvPr id="0" name="terminal_captura_real_1.png"/>
+                    <pic:cNvPicPr/>
+                  </pic:nvPicPr>
+                  <pic:blipFill>
+                    <a:blip r:embed="rId11"/>
+                    <a:stretch>
+                      <a:fillRect/>
+                    </a:stretch>
+                  </pic:blipFill>
+                  <pic:spPr>
+                    <a:xfrm>
+                      <a:off x="0" y="0"/>
+                      <a:ext cx="5669280" cy="3366135"/>
+                    </a:xfrm>
+                    <a:prstGeom prst="rect"/>
+                  </pic:spPr>
+                </pic:pic>
+              </a:graphicData>
+            </a:graphic>
+          </wp:inline>
+        </w:drawing>
+      </w:r>
+    </w:p>
+    <w:p>
+      <w:pPr>
+        <w:spacing w:after="200"/>
+        <w:jc w:val="center"/>
+      </w:pPr>
+      <w:r>
+        <w:rPr>
+          <w:rFonts w:ascii="Arial" w:hAnsi="Arial"/>
+          <w:i/>
+          <w:color w:val="646464"/>
+          <w:sz w:val="19"/>
+        </w:rPr>
+        <w:t>Figura 1: Captura real de terminal ejecutando Actuator Health y consultas iniciales en Render.</w:t>
+      </w:r>
+    </w:p>
+    <w:p>
+      <w:pPr>
         <w:keepNext/>
         <w:spacing w:before="240" w:after="60"/>
       </w:pPr>
@@ -3782,6 +3837,61 @@
           <w:sz w:val="30"/>
         </w:rPr>
         <w:t>13.3. Prueba E2E: POST /clientes Registro Exitoso Integral (HTTP 201)</w:t>
+      </w:r>
+    </w:p>
+    <w:p>
+      <w:pPr>
+        <w:spacing w:before="160" w:after="160"/>
+        <w:jc w:val="center"/>
+      </w:pPr>
+      <w:r>
+        <w:drawing>
+          <wp:inline xmlns:a="http://schemas.openxmlformats.org/drawingml/2006/main" xmlns:pic="http://schemas.openxmlformats.org/drawingml/2006/picture">
+            <wp:extent cx="5669280" cy="3366135"/>
+            <wp:docPr id="2" name="Picture 2"/>
+            <wp:cNvGraphicFramePr>
+              <a:graphicFrameLocks noChangeAspect="1"/>
+            </wp:cNvGraphicFramePr>
+            <a:graphic>
+              <a:graphicData uri="http://schemas.openxmlformats.org/drawingml/2006/picture">
+                <pic:pic>
+                  <pic:nvPicPr>
+                    <pic:cNvPr id="0" name="terminal_captura_real_2.png"/>
+                    <pic:cNvPicPr/>
+                  </pic:nvPicPr>
+                  <pic:blipFill>
+                    <a:blip r:embed="rId12"/>
+                    <a:stretch>
+                      <a:fillRect/>
+                    </a:stretch>
+                  </pic:blipFill>
+                  <pic:spPr>
+                    <a:xfrm>
+                      <a:off x="0" y="0"/>
+                      <a:ext cx="5669280" cy="3366135"/>
+                    </a:xfrm>
+                    <a:prstGeom prst="rect"/>
+                  </pic:spPr>
+                </pic:pic>
+              </a:graphicData>
+            </a:graphic>
+          </wp:inline>
+        </w:drawing>
+      </w:r>
+    </w:p>
+    <w:p>
+      <w:pPr>
+        <w:spacing w:after="200"/>
+        <w:jc w:val="center"/>
+      </w:pPr>
+      <w:r>
+        <w:rPr>
+          <w:rFonts w:ascii="Arial" w:hAnsi="Arial"/>
+          <w:i/>
+          <w:color w:val="646464"/>
+          <w:sz w:val="19"/>
+        </w:rPr>
+        <w:t>Figura 2: Captura real de terminal ejecutando el registro completo de cliente y autenticación JWT Bearer en Render.</w:t>
       </w:r>
     </w:p>
     <w:p>
@@ -4152,6 +4262,61 @@
           <w:sz w:val="30"/>
         </w:rPr>
         <w:t>13.8. Prueba E2E: DELETE /productos/cache Desalojo de Caché Redis</w:t>
+      </w:r>
+    </w:p>
+    <w:p>
+      <w:pPr>
+        <w:spacing w:before="160" w:after="160"/>
+        <w:jc w:val="center"/>
+      </w:pPr>
+      <w:r>
+        <w:drawing>
+          <wp:inline xmlns:a="http://schemas.openxmlformats.org/drawingml/2006/main" xmlns:pic="http://schemas.openxmlformats.org/drawingml/2006/picture">
+            <wp:extent cx="5669280" cy="3366135"/>
+            <wp:docPr id="3" name="Picture 3"/>
+            <wp:cNvGraphicFramePr>
+              <a:graphicFrameLocks noChangeAspect="1"/>
+            </wp:cNvGraphicFramePr>
+            <a:graphic>
+              <a:graphicData uri="http://schemas.openxmlformats.org/drawingml/2006/picture">
+                <pic:pic>
+                  <pic:nvPicPr>
+                    <pic:cNvPr id="0" name="terminal_captura_real_3.png"/>
+                    <pic:cNvPicPr/>
+                  </pic:nvPicPr>
+                  <pic:blipFill>
+                    <a:blip r:embed="rId13"/>
+                    <a:stretch>
+                      <a:fillRect/>
+                    </a:stretch>
+                  </pic:blipFill>
+                  <pic:spPr>
+                    <a:xfrm>
+                      <a:off x="0" y="0"/>
+                      <a:ext cx="5669280" cy="3366135"/>
+                    </a:xfrm>
+                    <a:prstGeom prst="rect"/>
+                  </pic:spPr>
+                </pic:pic>
+              </a:graphicData>
+            </a:graphic>
+          </wp:inline>
+        </w:drawing>
+      </w:r>
+    </w:p>
+    <w:p>
+      <w:pPr>
+        <w:spacing w:after="200"/>
+        <w:jc w:val="center"/>
+      </w:pPr>
+      <w:r>
+        <w:rPr>
+          <w:rFonts w:ascii="Arial" w:hAnsi="Arial"/>
+          <w:i/>
+          <w:color w:val="646464"/>
+          <w:sz w:val="19"/>
+        </w:rPr>
+        <w:t>Figura 3: Captura real de terminal ejecutando pruebas de validación 400 Bad Request, 409 Conflict y desalojo de caché en Redis.</w:t>
       </w:r>
     </w:p>
     <w:p>

</xml_diff>